<commit_message>
Update pitch demo amount to THB 20,000
Align the pitch script, demo stage, and QR-signing PoC around the updated THB 20,000 deal amount, including refund messaging and attack descriptions. Rename the pitch deck to its fixed filename.
</commit_message>
<xml_diff>
--- a/EsKrow+_Pitch_Script_TH.docx
+++ b/EsKrow+_Pitch_Script_TH.docx
@@ -1036,7 +1036,7 @@
           <w:szCs w:val="20"/>
           <w:lang w:val="th-TH" w:bidi="th-TH"/>
         </w:rPr>
-        <w:t xml:space="preserve">[สไลด์ 2: โพสต์ในไอจีของร้าน iPhone 15 ราคา 18,000 บาท “โอนก่อน ส่งไว”]</w:t>
+        <w:t xml:space="preserve">[สไลด์ 2: โพสต์ในไอจีของร้าน iPhone 15 ราคา 20,000 บาท “โอนก่อน ส่งไว”]</w:t>
       </w:r>
     </w:p>
     <w:p>
@@ -1051,7 +1051,7 @@
           <w:szCs w:val="28"/>
           <w:lang w:val="th-TH" w:bidi="th-TH"/>
         </w:rPr>
-        <w:t xml:space="preserve">นี่คือพลอยค่ะ อายุ 24 เพิ่งเริ่มงานแรก วันหนึ่งเธอเจอ iPhone 15 ในอินสตาแกรม ราคาแค่ 18,000 บาท ร้านบอกว่า “โอนก่อนนะคะ ส่งของให้วันนี้เลย” พลอยโอนไป… </w:t>
+        <w:t xml:space="preserve">นี่คือพลอยค่ะ อายุ 24 เพิ่งเริ่มงานแรก วันหนึ่งเธอเจอ iPhone 15 ในอินสตาแกรม ราคาแค่ 20,000 บาท ร้านบอกว่า “โอนก่อนนะคะ ส่งของให้วันนี้เลย” พลอยโอนไป… </w:t>
       </w:r>
       <w:r>
         <w:rPr>
@@ -1153,7 +1153,7 @@
           <w:szCs w:val="28"/>
           <w:lang w:val="th-TH" w:bidi="th-TH"/>
         </w:rPr>
-        <w:t xml:space="preserve">ปัญหาคือ ทุกวิธีที่เรามีวันนี้ เกิดขึ้นหลังจากเงินหายไปแล้วทั้งนั้น ทั้งแจ้งความ อายัดบัญชีม้า แล้วก็รอ สำหรับคนเพิ่งเริ่มทำงาน 18,000 บาทคือเงินเดือนเกือบทั้งเดือนค่ะ</w:t>
+        <w:t xml:space="preserve">ปัญหาคือ ทุกวิธีที่เรามีวันนี้ เกิดขึ้นหลังจากเงินหายไปแล้วทั้งนั้น ทั้งแจ้งความ อายัดบัญชีม้า แล้วก็รอ สำหรับคนเพิ่งเริ่มทำงาน 20,000 บาทคือเงินเดือนเกือบทั้งเดือนค่ะ</w:t>
       </w:r>
     </w:p>
     <w:p>
@@ -2717,7 +2717,7 @@
                 <w:szCs w:val="20"/>
                 <w:lang w:val="th-TH" w:bidi="th-TH"/>
               </w:rPr>
-              <w:t xml:space="preserve">18,000 บาทคือเงินเดือนเกือบทั้งเดือน</w:t>
+              <w:t xml:space="preserve">20,000 บาทคือเงินเดือนเกือบทั้งเดือน</w:t>
             </w:r>
           </w:p>
         </w:tc>

</xml_diff>